<commit_message>
Complete la partie architecture Yvan dans le rapport groupe
</commit_message>
<xml_diff>
--- a/01_Rendu_Groupe/Rapport_final/PE-2526_MSI526CSB_RapportGroupe_CyberTrust.docx
+++ b/01_Rendu_Groupe/Rapport_final/PE-2526_MSI526CSB_RapportGroupe_CyberTrust.docx
@@ -705,7 +705,7 @@
         </w:rPr>
         <w:fldChar w:fldCharType="separate"/>
       </w:r>
-      <w:hyperlink w:anchor="_Toc233327266" w:history="1">
+      <w:hyperlink w:anchor="_Toc233329704" w:history="1">
         <w:r>
           <w:rPr>
             <w:rStyle w:val="Hyperlink"/>
@@ -732,7 +732,7 @@
             <w:noProof/>
             <w:webHidden/>
           </w:rPr>
-          <w:instrText xml:space="preserve"> PAGEREF _Toc233327266 \h </w:instrText>
+          <w:instrText xml:space="preserve"> PAGEREF _Toc233329704 \h </w:instrText>
         </w:r>
         <w:r>
           <w:rPr>
@@ -778,7 +778,7 @@
           <w14:ligatures w14:val="standardContextual"/>
         </w:rPr>
       </w:pPr>
-      <w:hyperlink w:anchor="_Toc233327267" w:history="1">
+      <w:hyperlink w:anchor="_Toc233329705" w:history="1">
         <w:r>
           <w:rPr>
             <w:rStyle w:val="Hyperlink"/>
@@ -805,7 +805,7 @@
             <w:noProof/>
             <w:webHidden/>
           </w:rPr>
-          <w:instrText xml:space="preserve"> PAGEREF _Toc233327267 \h </w:instrText>
+          <w:instrText xml:space="preserve"> PAGEREF _Toc233329705 \h </w:instrText>
         </w:r>
         <w:r>
           <w:rPr>
@@ -851,7 +851,7 @@
           <w14:ligatures w14:val="standardContextual"/>
         </w:rPr>
       </w:pPr>
-      <w:hyperlink w:anchor="_Toc233327268" w:history="1">
+      <w:hyperlink w:anchor="_Toc233329706" w:history="1">
         <w:r>
           <w:rPr>
             <w:rStyle w:val="Hyperlink"/>
@@ -878,7 +878,7 @@
             <w:noProof/>
             <w:webHidden/>
           </w:rPr>
-          <w:instrText xml:space="preserve"> PAGEREF _Toc233327268 \h </w:instrText>
+          <w:instrText xml:space="preserve"> PAGEREF _Toc233329706 \h </w:instrText>
         </w:r>
         <w:r>
           <w:rPr>
@@ -924,7 +924,7 @@
           <w14:ligatures w14:val="standardContextual"/>
         </w:rPr>
       </w:pPr>
-      <w:hyperlink w:anchor="_Toc233327269" w:history="1">
+      <w:hyperlink w:anchor="_Toc233329707" w:history="1">
         <w:r>
           <w:rPr>
             <w:rStyle w:val="Hyperlink"/>
@@ -951,7 +951,7 @@
             <w:noProof/>
             <w:webHidden/>
           </w:rPr>
-          <w:instrText xml:space="preserve"> PAGEREF _Toc233327269 \h </w:instrText>
+          <w:instrText xml:space="preserve"> PAGEREF _Toc233329707 \h </w:instrText>
         </w:r>
         <w:r>
           <w:rPr>
@@ -997,7 +997,7 @@
           <w14:ligatures w14:val="standardContextual"/>
         </w:rPr>
       </w:pPr>
-      <w:hyperlink w:anchor="_Toc233327270" w:history="1">
+      <w:hyperlink w:anchor="_Toc233329708" w:history="1">
         <w:r>
           <w:rPr>
             <w:rStyle w:val="Hyperlink"/>
@@ -1024,7 +1024,7 @@
             <w:noProof/>
             <w:webHidden/>
           </w:rPr>
-          <w:instrText xml:space="preserve"> PAGEREF _Toc233327270 \h </w:instrText>
+          <w:instrText xml:space="preserve"> PAGEREF _Toc233329708 \h </w:instrText>
         </w:r>
         <w:r>
           <w:rPr>
@@ -1070,7 +1070,7 @@
           <w14:ligatures w14:val="standardContextual"/>
         </w:rPr>
       </w:pPr>
-      <w:hyperlink w:anchor="_Toc233327271" w:history="1">
+      <w:hyperlink w:anchor="_Toc233329709" w:history="1">
         <w:r>
           <w:rPr>
             <w:rStyle w:val="Hyperlink"/>
@@ -1097,7 +1097,7 @@
             <w:noProof/>
             <w:webHidden/>
           </w:rPr>
-          <w:instrText xml:space="preserve"> PAGEREF _Toc233327271 \h </w:instrText>
+          <w:instrText xml:space="preserve"> PAGEREF _Toc233329709 \h </w:instrText>
         </w:r>
         <w:r>
           <w:rPr>
@@ -1143,7 +1143,7 @@
           <w14:ligatures w14:val="standardContextual"/>
         </w:rPr>
       </w:pPr>
-      <w:hyperlink w:anchor="_Toc233327272" w:history="1">
+      <w:hyperlink w:anchor="_Toc233329710" w:history="1">
         <w:r>
           <w:rPr>
             <w:rStyle w:val="Hyperlink"/>
@@ -1170,7 +1170,7 @@
             <w:noProof/>
             <w:webHidden/>
           </w:rPr>
-          <w:instrText xml:space="preserve"> PAGEREF _Toc233327272 \h </w:instrText>
+          <w:instrText xml:space="preserve"> PAGEREF _Toc233329710 \h </w:instrText>
         </w:r>
         <w:r>
           <w:rPr>
@@ -1216,7 +1216,7 @@
           <w14:ligatures w14:val="standardContextual"/>
         </w:rPr>
       </w:pPr>
-      <w:hyperlink w:anchor="_Toc233327273" w:history="1">
+      <w:hyperlink w:anchor="_Toc233329711" w:history="1">
         <w:r>
           <w:rPr>
             <w:rStyle w:val="Hyperlink"/>
@@ -1243,7 +1243,7 @@
             <w:noProof/>
             <w:webHidden/>
           </w:rPr>
-          <w:instrText xml:space="preserve"> PAGEREF _Toc233327273 \h </w:instrText>
+          <w:instrText xml:space="preserve"> PAGEREF _Toc233329711 \h </w:instrText>
         </w:r>
         <w:r>
           <w:rPr>
@@ -1289,7 +1289,7 @@
           <w14:ligatures w14:val="standardContextual"/>
         </w:rPr>
       </w:pPr>
-      <w:hyperlink w:anchor="_Toc233327274" w:history="1">
+      <w:hyperlink w:anchor="_Toc233329712" w:history="1">
         <w:r>
           <w:rPr>
             <w:rStyle w:val="Hyperlink"/>
@@ -1316,7 +1316,7 @@
             <w:noProof/>
             <w:webHidden/>
           </w:rPr>
-          <w:instrText xml:space="preserve"> PAGEREF _Toc233327274 \h </w:instrText>
+          <w:instrText xml:space="preserve"> PAGEREF _Toc233329712 \h </w:instrText>
         </w:r>
         <w:r>
           <w:rPr>
@@ -1362,7 +1362,7 @@
           <w14:ligatures w14:val="standardContextual"/>
         </w:rPr>
       </w:pPr>
-      <w:hyperlink w:anchor="_Toc233327275" w:history="1">
+      <w:hyperlink w:anchor="_Toc233329713" w:history="1">
         <w:r>
           <w:rPr>
             <w:rStyle w:val="Hyperlink"/>
@@ -1389,7 +1389,7 @@
             <w:noProof/>
             <w:webHidden/>
           </w:rPr>
-          <w:instrText xml:space="preserve"> PAGEREF _Toc233327275 \h </w:instrText>
+          <w:instrText xml:space="preserve"> PAGEREF _Toc233329713 \h </w:instrText>
         </w:r>
         <w:r>
           <w:rPr>
@@ -1435,7 +1435,7 @@
           <w14:ligatures w14:val="standardContextual"/>
         </w:rPr>
       </w:pPr>
-      <w:hyperlink w:anchor="_Toc233327276" w:history="1">
+      <w:hyperlink w:anchor="_Toc233329714" w:history="1">
         <w:r>
           <w:rPr>
             <w:rStyle w:val="Hyperlink"/>
@@ -1462,7 +1462,7 @@
             <w:noProof/>
             <w:webHidden/>
           </w:rPr>
-          <w:instrText xml:space="preserve"> PAGEREF _Toc233327276 \h </w:instrText>
+          <w:instrText xml:space="preserve"> PAGEREF _Toc233329714 \h </w:instrText>
         </w:r>
         <w:r>
           <w:rPr>
@@ -1508,7 +1508,7 @@
           <w14:ligatures w14:val="standardContextual"/>
         </w:rPr>
       </w:pPr>
-      <w:hyperlink w:anchor="_Toc233327277" w:history="1">
+      <w:hyperlink w:anchor="_Toc233329715" w:history="1">
         <w:r>
           <w:rPr>
             <w:rStyle w:val="Hyperlink"/>
@@ -1535,7 +1535,7 @@
             <w:noProof/>
             <w:webHidden/>
           </w:rPr>
-          <w:instrText xml:space="preserve"> PAGEREF _Toc233327277 \h </w:instrText>
+          <w:instrText xml:space="preserve"> PAGEREF _Toc233329715 \h </w:instrText>
         </w:r>
         <w:r>
           <w:rPr>
@@ -1581,7 +1581,7 @@
           <w14:ligatures w14:val="standardContextual"/>
         </w:rPr>
       </w:pPr>
-      <w:hyperlink w:anchor="_Toc233327278" w:history="1">
+      <w:hyperlink w:anchor="_Toc233329716" w:history="1">
         <w:r>
           <w:rPr>
             <w:rStyle w:val="Hyperlink"/>
@@ -1608,7 +1608,7 @@
             <w:noProof/>
             <w:webHidden/>
           </w:rPr>
-          <w:instrText xml:space="preserve"> PAGEREF _Toc233327278 \h </w:instrText>
+          <w:instrText xml:space="preserve"> PAGEREF _Toc233329716 \h </w:instrText>
         </w:r>
         <w:r>
           <w:rPr>
@@ -1654,7 +1654,7 @@
           <w14:ligatures w14:val="standardContextual"/>
         </w:rPr>
       </w:pPr>
-      <w:hyperlink w:anchor="_Toc233327279" w:history="1">
+      <w:hyperlink w:anchor="_Toc233329717" w:history="1">
         <w:r>
           <w:rPr>
             <w:rStyle w:val="Hyperlink"/>
@@ -1681,7 +1681,7 @@
             <w:noProof/>
             <w:webHidden/>
           </w:rPr>
-          <w:instrText xml:space="preserve"> PAGEREF _Toc233327279 \h </w:instrText>
+          <w:instrText xml:space="preserve"> PAGEREF _Toc233329717 \h </w:instrText>
         </w:r>
         <w:r>
           <w:rPr>
@@ -1727,7 +1727,7 @@
           <w14:ligatures w14:val="standardContextual"/>
         </w:rPr>
       </w:pPr>
-      <w:hyperlink w:anchor="_Toc233327280" w:history="1">
+      <w:hyperlink w:anchor="_Toc233329718" w:history="1">
         <w:r>
           <w:rPr>
             <w:rStyle w:val="Hyperlink"/>
@@ -1754,7 +1754,7 @@
             <w:noProof/>
             <w:webHidden/>
           </w:rPr>
-          <w:instrText xml:space="preserve"> PAGEREF _Toc233327280 \h </w:instrText>
+          <w:instrText xml:space="preserve"> PAGEREF _Toc233329718 \h </w:instrText>
         </w:r>
         <w:r>
           <w:rPr>
@@ -1800,7 +1800,7 @@
           <w14:ligatures w14:val="standardContextual"/>
         </w:rPr>
       </w:pPr>
-      <w:hyperlink w:anchor="_Toc233327281" w:history="1">
+      <w:hyperlink w:anchor="_Toc233329719" w:history="1">
         <w:r>
           <w:rPr>
             <w:rStyle w:val="Hyperlink"/>
@@ -1827,7 +1827,7 @@
             <w:noProof/>
             <w:webHidden/>
           </w:rPr>
-          <w:instrText xml:space="preserve"> PAGEREF _Toc233327281 \h </w:instrText>
+          <w:instrText xml:space="preserve"> PAGEREF _Toc233329719 \h </w:instrText>
         </w:r>
         <w:r>
           <w:rPr>
@@ -1873,7 +1873,7 @@
           <w14:ligatures w14:val="standardContextual"/>
         </w:rPr>
       </w:pPr>
-      <w:hyperlink w:anchor="_Toc233327282" w:history="1">
+      <w:hyperlink w:anchor="_Toc233329720" w:history="1">
         <w:r>
           <w:rPr>
             <w:rStyle w:val="Hyperlink"/>
@@ -1900,7 +1900,7 @@
             <w:noProof/>
             <w:webHidden/>
           </w:rPr>
-          <w:instrText xml:space="preserve"> PAGEREF _Toc233327282 \h </w:instrText>
+          <w:instrText xml:space="preserve"> PAGEREF _Toc233329720 \h </w:instrText>
         </w:r>
         <w:r>
           <w:rPr>
@@ -1946,7 +1946,7 @@
           <w14:ligatures w14:val="standardContextual"/>
         </w:rPr>
       </w:pPr>
-      <w:hyperlink w:anchor="_Toc233327283" w:history="1">
+      <w:hyperlink w:anchor="_Toc233329721" w:history="1">
         <w:r>
           <w:rPr>
             <w:rStyle w:val="Hyperlink"/>
@@ -1973,7 +1973,7 @@
             <w:noProof/>
             <w:webHidden/>
           </w:rPr>
-          <w:instrText xml:space="preserve"> PAGEREF _Toc233327283 \h </w:instrText>
+          <w:instrText xml:space="preserve"> PAGEREF _Toc233329721 \h </w:instrText>
         </w:r>
         <w:r>
           <w:rPr>
@@ -2019,7 +2019,7 @@
           <w14:ligatures w14:val="standardContextual"/>
         </w:rPr>
       </w:pPr>
-      <w:hyperlink w:anchor="_Toc233327284" w:history="1">
+      <w:hyperlink w:anchor="_Toc233329722" w:history="1">
         <w:r>
           <w:rPr>
             <w:rStyle w:val="Hyperlink"/>
@@ -2046,7 +2046,7 @@
             <w:noProof/>
             <w:webHidden/>
           </w:rPr>
-          <w:instrText xml:space="preserve"> PAGEREF _Toc233327284 \h </w:instrText>
+          <w:instrText xml:space="preserve"> PAGEREF _Toc233329722 \h </w:instrText>
         </w:r>
         <w:r>
           <w:rPr>
@@ -2092,7 +2092,7 @@
           <w14:ligatures w14:val="standardContextual"/>
         </w:rPr>
       </w:pPr>
-      <w:hyperlink w:anchor="_Toc233327285" w:history="1">
+      <w:hyperlink w:anchor="_Toc233329723" w:history="1">
         <w:r>
           <w:rPr>
             <w:rStyle w:val="Hyperlink"/>
@@ -2119,7 +2119,7 @@
             <w:noProof/>
             <w:webHidden/>
           </w:rPr>
-          <w:instrText xml:space="preserve"> PAGEREF _Toc233327285 \h </w:instrText>
+          <w:instrText xml:space="preserve"> PAGEREF _Toc233329723 \h </w:instrText>
         </w:r>
         <w:r>
           <w:rPr>
@@ -2165,7 +2165,7 @@
           <w14:ligatures w14:val="standardContextual"/>
         </w:rPr>
       </w:pPr>
-      <w:hyperlink w:anchor="_Toc233327286" w:history="1">
+      <w:hyperlink w:anchor="_Toc233329724" w:history="1">
         <w:r>
           <w:rPr>
             <w:rStyle w:val="Hyperlink"/>
@@ -2192,7 +2192,7 @@
             <w:noProof/>
             <w:webHidden/>
           </w:rPr>
-          <w:instrText xml:space="preserve"> PAGEREF _Toc233327286 \h </w:instrText>
+          <w:instrText xml:space="preserve"> PAGEREF _Toc233329724 \h </w:instrText>
         </w:r>
         <w:r>
           <w:rPr>
@@ -2238,7 +2238,7 @@
           <w14:ligatures w14:val="standardContextual"/>
         </w:rPr>
       </w:pPr>
-      <w:hyperlink w:anchor="_Toc233327287" w:history="1">
+      <w:hyperlink w:anchor="_Toc233329725" w:history="1">
         <w:r>
           <w:rPr>
             <w:rStyle w:val="Hyperlink"/>
@@ -2265,7 +2265,7 @@
             <w:noProof/>
             <w:webHidden/>
           </w:rPr>
-          <w:instrText xml:space="preserve"> PAGEREF _Toc233327287 \h </w:instrText>
+          <w:instrText xml:space="preserve"> PAGEREF _Toc233329725 \h </w:instrText>
         </w:r>
         <w:r>
           <w:rPr>
@@ -2311,7 +2311,7 @@
           <w14:ligatures w14:val="standardContextual"/>
         </w:rPr>
       </w:pPr>
-      <w:hyperlink w:anchor="_Toc233327288" w:history="1">
+      <w:hyperlink w:anchor="_Toc233329726" w:history="1">
         <w:r>
           <w:rPr>
             <w:rStyle w:val="Hyperlink"/>
@@ -2338,7 +2338,7 @@
             <w:noProof/>
             <w:webHidden/>
           </w:rPr>
-          <w:instrText xml:space="preserve"> PAGEREF _Toc233327288 \h </w:instrText>
+          <w:instrText xml:space="preserve"> PAGEREF _Toc233329726 \h </w:instrText>
         </w:r>
         <w:r>
           <w:rPr>
@@ -2384,7 +2384,7 @@
           <w14:ligatures w14:val="standardContextual"/>
         </w:rPr>
       </w:pPr>
-      <w:hyperlink w:anchor="_Toc233327289" w:history="1">
+      <w:hyperlink w:anchor="_Toc233329727" w:history="1">
         <w:r>
           <w:rPr>
             <w:rStyle w:val="Hyperlink"/>
@@ -2411,7 +2411,7 @@
             <w:noProof/>
             <w:webHidden/>
           </w:rPr>
-          <w:instrText xml:space="preserve"> PAGEREF _Toc233327289 \h </w:instrText>
+          <w:instrText xml:space="preserve"> PAGEREF _Toc233329727 \h </w:instrText>
         </w:r>
         <w:r>
           <w:rPr>
@@ -2457,7 +2457,7 @@
           <w14:ligatures w14:val="standardContextual"/>
         </w:rPr>
       </w:pPr>
-      <w:hyperlink w:anchor="_Toc233327290" w:history="1">
+      <w:hyperlink w:anchor="_Toc233329728" w:history="1">
         <w:r>
           <w:rPr>
             <w:rStyle w:val="Hyperlink"/>
@@ -2484,7 +2484,7 @@
             <w:noProof/>
             <w:webHidden/>
           </w:rPr>
-          <w:instrText xml:space="preserve"> PAGEREF _Toc233327290 \h </w:instrText>
+          <w:instrText xml:space="preserve"> PAGEREF _Toc233329728 \h </w:instrText>
         </w:r>
         <w:r>
           <w:rPr>
@@ -2530,7 +2530,7 @@
           <w14:ligatures w14:val="standardContextual"/>
         </w:rPr>
       </w:pPr>
-      <w:hyperlink w:anchor="_Toc233327291" w:history="1">
+      <w:hyperlink w:anchor="_Toc233329729" w:history="1">
         <w:r>
           <w:rPr>
             <w:rStyle w:val="Hyperlink"/>
@@ -2557,7 +2557,7 @@
             <w:noProof/>
             <w:webHidden/>
           </w:rPr>
-          <w:instrText xml:space="preserve"> PAGEREF _Toc233327291 \h </w:instrText>
+          <w:instrText xml:space="preserve"> PAGEREF _Toc233329729 \h </w:instrText>
         </w:r>
         <w:r>
           <w:rPr>
@@ -2603,7 +2603,7 @@
           <w14:ligatures w14:val="standardContextual"/>
         </w:rPr>
       </w:pPr>
-      <w:hyperlink w:anchor="_Toc233327292" w:history="1">
+      <w:hyperlink w:anchor="_Toc233329730" w:history="1">
         <w:r>
           <w:rPr>
             <w:rStyle w:val="Hyperlink"/>
@@ -2630,7 +2630,7 @@
             <w:noProof/>
             <w:webHidden/>
           </w:rPr>
-          <w:instrText xml:space="preserve"> PAGEREF _Toc233327292 \h </w:instrText>
+          <w:instrText xml:space="preserve"> PAGEREF _Toc233329730 \h </w:instrText>
         </w:r>
         <w:r>
           <w:rPr>
@@ -2676,7 +2676,7 @@
           <w14:ligatures w14:val="standardContextual"/>
         </w:rPr>
       </w:pPr>
-      <w:hyperlink w:anchor="_Toc233327293" w:history="1">
+      <w:hyperlink w:anchor="_Toc233329731" w:history="1">
         <w:r>
           <w:rPr>
             <w:rStyle w:val="Hyperlink"/>
@@ -2703,7 +2703,7 @@
             <w:noProof/>
             <w:webHidden/>
           </w:rPr>
-          <w:instrText xml:space="preserve"> PAGEREF _Toc233327293 \h </w:instrText>
+          <w:instrText xml:space="preserve"> PAGEREF _Toc233329731 \h </w:instrText>
         </w:r>
         <w:r>
           <w:rPr>
@@ -2749,7 +2749,7 @@
           <w14:ligatures w14:val="standardContextual"/>
         </w:rPr>
       </w:pPr>
-      <w:hyperlink w:anchor="_Toc233327294" w:history="1">
+      <w:hyperlink w:anchor="_Toc233329732" w:history="1">
         <w:r>
           <w:rPr>
             <w:rStyle w:val="Hyperlink"/>
@@ -2776,7 +2776,7 @@
             <w:noProof/>
             <w:webHidden/>
           </w:rPr>
-          <w:instrText xml:space="preserve"> PAGEREF _Toc233327294 \h </w:instrText>
+          <w:instrText xml:space="preserve"> PAGEREF _Toc233329732 \h </w:instrText>
         </w:r>
         <w:r>
           <w:rPr>
@@ -2822,7 +2822,7 @@
           <w14:ligatures w14:val="standardContextual"/>
         </w:rPr>
       </w:pPr>
-      <w:hyperlink w:anchor="_Toc233327295" w:history="1">
+      <w:hyperlink w:anchor="_Toc233329733" w:history="1">
         <w:r>
           <w:rPr>
             <w:rStyle w:val="Hyperlink"/>
@@ -2849,7 +2849,7 @@
             <w:noProof/>
             <w:webHidden/>
           </w:rPr>
-          <w:instrText xml:space="preserve"> PAGEREF _Toc233327295 \h </w:instrText>
+          <w:instrText xml:space="preserve"> PAGEREF _Toc233329733 \h </w:instrText>
         </w:r>
         <w:r>
           <w:rPr>
@@ -2895,7 +2895,7 @@
           <w14:ligatures w14:val="standardContextual"/>
         </w:rPr>
       </w:pPr>
-      <w:hyperlink w:anchor="_Toc233327296" w:history="1">
+      <w:hyperlink w:anchor="_Toc233329734" w:history="1">
         <w:r>
           <w:rPr>
             <w:rStyle w:val="Hyperlink"/>
@@ -2922,7 +2922,7 @@
             <w:noProof/>
             <w:webHidden/>
           </w:rPr>
-          <w:instrText xml:space="preserve"> PAGEREF _Toc233327296 \h </w:instrText>
+          <w:instrText xml:space="preserve"> PAGEREF _Toc233329734 \h </w:instrText>
         </w:r>
         <w:r>
           <w:rPr>
@@ -2968,7 +2968,7 @@
           <w14:ligatures w14:val="standardContextual"/>
         </w:rPr>
       </w:pPr>
-      <w:hyperlink w:anchor="_Toc233327297" w:history="1">
+      <w:hyperlink w:anchor="_Toc233329735" w:history="1">
         <w:r>
           <w:rPr>
             <w:rStyle w:val="Hyperlink"/>
@@ -2995,7 +2995,7 @@
             <w:noProof/>
             <w:webHidden/>
           </w:rPr>
-          <w:instrText xml:space="preserve"> PAGEREF _Toc233327297 \h </w:instrText>
+          <w:instrText xml:space="preserve"> PAGEREF _Toc233329735 \h </w:instrText>
         </w:r>
         <w:r>
           <w:rPr>
@@ -3016,6 +3016,298 @@
             <w:webHidden/>
           </w:rPr>
           <w:t>24</w:t>
+        </w:r>
+        <w:r>
+          <w:rPr>
+            <w:noProof/>
+            <w:webHidden/>
+          </w:rPr>
+          <w:fldChar w:fldCharType="end"/>
+        </w:r>
+      </w:hyperlink>
+    </w:p>
+    <w:p>
+      <w:pPr>
+        <w:pStyle w:val="TOC1"/>
+        <w:tabs>
+          <w:tab w:val="right" w:leader="dot" w:pos="9736"/>
+        </w:tabs>
+        <w:rPr>
+          <w:rFonts w:asciiTheme="minorHAnsi" w:eastAsiaTheme="minorEastAsia" w:hAnsiTheme="minorHAnsi" w:cstheme="minorBidi"/>
+          <w:noProof/>
+          <w:kern w:val="2"/>
+          <w:sz w:val="24"/>
+          <w:szCs w:val="24"/>
+          <w14:ligatures w14:val="standardContextual"/>
+        </w:rPr>
+      </w:pPr>
+      <w:hyperlink w:anchor="_Toc233329736" w:history="1">
+        <w:r>
+          <w:rPr>
+            <w:rStyle w:val="Hyperlink"/>
+            <w:noProof/>
+          </w:rPr>
+          <w:t>Annexe D : Sch?mas d?taill?s de la contribution architecture</w:t>
+        </w:r>
+        <w:r>
+          <w:rPr>
+            <w:noProof/>
+            <w:webHidden/>
+          </w:rPr>
+          <w:tab/>
+        </w:r>
+        <w:r>
+          <w:rPr>
+            <w:noProof/>
+            <w:webHidden/>
+          </w:rPr>
+          <w:fldChar w:fldCharType="begin"/>
+        </w:r>
+        <w:r>
+          <w:rPr>
+            <w:noProof/>
+            <w:webHidden/>
+          </w:rPr>
+          <w:instrText xml:space="preserve"> PAGEREF _Toc233329736 \h </w:instrText>
+        </w:r>
+        <w:r>
+          <w:rPr>
+            <w:noProof/>
+            <w:webHidden/>
+          </w:rPr>
+        </w:r>
+        <w:r>
+          <w:rPr>
+            <w:noProof/>
+            <w:webHidden/>
+          </w:rPr>
+          <w:fldChar w:fldCharType="separate"/>
+        </w:r>
+        <w:r>
+          <w:rPr>
+            <w:noProof/>
+            <w:webHidden/>
+          </w:rPr>
+          <w:t>25</w:t>
+        </w:r>
+        <w:r>
+          <w:rPr>
+            <w:noProof/>
+            <w:webHidden/>
+          </w:rPr>
+          <w:fldChar w:fldCharType="end"/>
+        </w:r>
+      </w:hyperlink>
+    </w:p>
+    <w:p>
+      <w:pPr>
+        <w:pStyle w:val="TOC2"/>
+        <w:tabs>
+          <w:tab w:val="right" w:leader="dot" w:pos="9736"/>
+        </w:tabs>
+        <w:rPr>
+          <w:rFonts w:asciiTheme="minorHAnsi" w:eastAsiaTheme="minorEastAsia" w:hAnsiTheme="minorHAnsi" w:cstheme="minorBidi"/>
+          <w:noProof/>
+          <w:kern w:val="2"/>
+          <w:sz w:val="24"/>
+          <w:szCs w:val="24"/>
+          <w14:ligatures w14:val="standardContextual"/>
+        </w:rPr>
+      </w:pPr>
+      <w:hyperlink w:anchor="_Toc233329737" w:history="1">
+        <w:r>
+          <w:rPr>
+            <w:rStyle w:val="Hyperlink"/>
+            <w:noProof/>
+          </w:rPr>
+          <w:t>Sch?ma pfSense, flux autoris?s et flux bloqu?s</w:t>
+        </w:r>
+        <w:r>
+          <w:rPr>
+            <w:noProof/>
+            <w:webHidden/>
+          </w:rPr>
+          <w:tab/>
+        </w:r>
+        <w:r>
+          <w:rPr>
+            <w:noProof/>
+            <w:webHidden/>
+          </w:rPr>
+          <w:fldChar w:fldCharType="begin"/>
+        </w:r>
+        <w:r>
+          <w:rPr>
+            <w:noProof/>
+            <w:webHidden/>
+          </w:rPr>
+          <w:instrText xml:space="preserve"> PAGEREF _Toc233329737 \h </w:instrText>
+        </w:r>
+        <w:r>
+          <w:rPr>
+            <w:noProof/>
+            <w:webHidden/>
+          </w:rPr>
+        </w:r>
+        <w:r>
+          <w:rPr>
+            <w:noProof/>
+            <w:webHidden/>
+          </w:rPr>
+          <w:fldChar w:fldCharType="separate"/>
+        </w:r>
+        <w:r>
+          <w:rPr>
+            <w:noProof/>
+            <w:webHidden/>
+          </w:rPr>
+          <w:t>25</w:t>
+        </w:r>
+        <w:r>
+          <w:rPr>
+            <w:noProof/>
+            <w:webHidden/>
+          </w:rPr>
+          <w:fldChar w:fldCharType="end"/>
+        </w:r>
+      </w:hyperlink>
+    </w:p>
+    <w:p>
+      <w:pPr>
+        <w:pStyle w:val="TOC2"/>
+        <w:tabs>
+          <w:tab w:val="right" w:leader="dot" w:pos="9736"/>
+        </w:tabs>
+        <w:rPr>
+          <w:rFonts w:asciiTheme="minorHAnsi" w:eastAsiaTheme="minorEastAsia" w:hAnsiTheme="minorHAnsi" w:cstheme="minorBidi"/>
+          <w:noProof/>
+          <w:kern w:val="2"/>
+          <w:sz w:val="24"/>
+          <w:szCs w:val="24"/>
+          <w14:ligatures w14:val="standardContextual"/>
+        </w:rPr>
+      </w:pPr>
+      <w:hyperlink w:anchor="_Toc233329738" w:history="1">
+        <w:r>
+          <w:rPr>
+            <w:rStyle w:val="Hyperlink"/>
+            <w:noProof/>
+          </w:rPr>
+          <w:t>Sch?ma SOC Wazuh et cha?ne de supervision</w:t>
+        </w:r>
+        <w:r>
+          <w:rPr>
+            <w:noProof/>
+            <w:webHidden/>
+          </w:rPr>
+          <w:tab/>
+        </w:r>
+        <w:r>
+          <w:rPr>
+            <w:noProof/>
+            <w:webHidden/>
+          </w:rPr>
+          <w:fldChar w:fldCharType="begin"/>
+        </w:r>
+        <w:r>
+          <w:rPr>
+            <w:noProof/>
+            <w:webHidden/>
+          </w:rPr>
+          <w:instrText xml:space="preserve"> PAGEREF _Toc233329738 \h </w:instrText>
+        </w:r>
+        <w:r>
+          <w:rPr>
+            <w:noProof/>
+            <w:webHidden/>
+          </w:rPr>
+        </w:r>
+        <w:r>
+          <w:rPr>
+            <w:noProof/>
+            <w:webHidden/>
+          </w:rPr>
+          <w:fldChar w:fldCharType="separate"/>
+        </w:r>
+        <w:r>
+          <w:rPr>
+            <w:noProof/>
+            <w:webHidden/>
+          </w:rPr>
+          <w:t>26</w:t>
+        </w:r>
+        <w:r>
+          <w:rPr>
+            <w:noProof/>
+            <w:webHidden/>
+          </w:rPr>
+          <w:fldChar w:fldCharType="end"/>
+        </w:r>
+      </w:hyperlink>
+    </w:p>
+    <w:p>
+      <w:pPr>
+        <w:pStyle w:val="TOC2"/>
+        <w:tabs>
+          <w:tab w:val="right" w:leader="dot" w:pos="9736"/>
+        </w:tabs>
+        <w:rPr>
+          <w:rFonts w:asciiTheme="minorHAnsi" w:eastAsiaTheme="minorEastAsia" w:hAnsiTheme="minorHAnsi" w:cstheme="minorBidi"/>
+          <w:noProof/>
+          <w:kern w:val="2"/>
+          <w:sz w:val="24"/>
+          <w:szCs w:val="24"/>
+          <w14:ligatures w14:val="standardContextual"/>
+        </w:rPr>
+      </w:pPr>
+      <w:hyperlink w:anchor="_Toc233329739" w:history="1">
+        <w:r>
+          <w:rPr>
+            <w:rStyle w:val="Hyperlink"/>
+            <w:noProof/>
+          </w:rPr>
+          <w:t>Ressources associ?es dans le d?p?t</w:t>
+        </w:r>
+        <w:r>
+          <w:rPr>
+            <w:noProof/>
+            <w:webHidden/>
+          </w:rPr>
+          <w:tab/>
+        </w:r>
+        <w:r>
+          <w:rPr>
+            <w:noProof/>
+            <w:webHidden/>
+          </w:rPr>
+          <w:fldChar w:fldCharType="begin"/>
+        </w:r>
+        <w:r>
+          <w:rPr>
+            <w:noProof/>
+            <w:webHidden/>
+          </w:rPr>
+          <w:instrText xml:space="preserve"> PAGEREF _Toc233329739 \h </w:instrText>
+        </w:r>
+        <w:r>
+          <w:rPr>
+            <w:noProof/>
+            <w:webHidden/>
+          </w:rPr>
+        </w:r>
+        <w:r>
+          <w:rPr>
+            <w:noProof/>
+            <w:webHidden/>
+          </w:rPr>
+          <w:fldChar w:fldCharType="separate"/>
+        </w:r>
+        <w:r>
+          <w:rPr>
+            <w:noProof/>
+            <w:webHidden/>
+          </w:rPr>
+          <w:t>26</w:t>
         </w:r>
         <w:r>
           <w:rPr>
@@ -3056,7 +3348,7 @@
         <w:keepNext/>
         <w:keepLines/>
       </w:pPr>
-      <w:bookmarkStart w:id="0" w:name="_Toc233327266"/>
+      <w:bookmarkStart w:id="0" w:name="_Toc233329704"/>
       <w:r>
         <w:lastRenderedPageBreak/>
         <w:t>1. Présentation de l’entreprise et de l’équipe projet</w:t>
@@ -4202,7 +4494,7 @@
         <w:keepNext/>
         <w:keepLines/>
       </w:pPr>
-      <w:bookmarkStart w:id="1" w:name="_Toc233327267"/>
+      <w:bookmarkStart w:id="1" w:name="_Toc233329705"/>
       <w:r>
         <w:t>2. Analyse de la problématique et introduction à la solution proposée</w:t>
       </w:r>
@@ -4241,7 +4533,6 @@
           <w:color w:val="111827"/>
           <w:sz w:val="20"/>
         </w:rPr>
-        <w:lastRenderedPageBreak/>
         <w:t>La solution proposée par Cyber Trust repose sur trois piliers : une architecture segmentée et défendable, une collecte SIEM centralisée avec Wazuh, et des procédures de traitement permettant de passer de l’alerte brute à une décision exploitable. Le démonstrateur prouve ces trois dimensions dans un environnement local volontairement maîtrisé.</w:t>
       </w:r>
     </w:p>
@@ -4952,7 +5243,7 @@
         <w:keepLines/>
         <w:spacing w:before="180" w:after="80"/>
       </w:pPr>
-      <w:bookmarkStart w:id="2" w:name="_Toc233327268"/>
+      <w:bookmarkStart w:id="2" w:name="_Toc233329706"/>
       <w:r>
         <w:t>2.1. Périmètre démontré et périmètre cible</w:t>
       </w:r>
@@ -5483,7 +5774,7 @@
         <w:keepLines/>
         <w:spacing w:after="80"/>
       </w:pPr>
-      <w:bookmarkStart w:id="3" w:name="_Toc233327269"/>
+      <w:bookmarkStart w:id="3" w:name="_Toc233329707"/>
       <w:r>
         <w:rPr>
           <w:sz w:val="26"/>
@@ -5548,7 +5839,6 @@
                 <w:color w:val="174A7C"/>
                 <w:sz w:val="18"/>
               </w:rPr>
-              <w:lastRenderedPageBreak/>
               <w:t>Surface observée</w:t>
             </w:r>
           </w:p>
@@ -6216,7 +6506,7 @@
         <w:keepNext/>
         <w:keepLines/>
       </w:pPr>
-      <w:bookmarkStart w:id="4" w:name="_Toc233327270"/>
+      <w:bookmarkStart w:id="4" w:name="_Toc233329708"/>
       <w:r>
         <w:t>3. Gestion des coûts</w:t>
       </w:r>
@@ -7203,7 +7493,6 @@
                 <w:color w:val="174A7C"/>
                 <w:sz w:val="18"/>
               </w:rPr>
-              <w:lastRenderedPageBreak/>
               <w:t>Poste récurrent</w:t>
             </w:r>
           </w:p>
@@ -8189,7 +8478,7 @@
         <w:keepNext/>
         <w:keepLines/>
       </w:pPr>
-      <w:bookmarkStart w:id="5" w:name="_Toc233327271"/>
+      <w:bookmarkStart w:id="5" w:name="_Toc233329709"/>
       <w:r>
         <w:t>4. Organisation de l’équipe, planification détaillée et méthodologies appliquées</w:t>
       </w:r>
@@ -9018,7 +9307,6 @@
                 <w:color w:val="111827"/>
                 <w:sz w:val="16"/>
               </w:rPr>
-              <w:lastRenderedPageBreak/>
               <w:t>6. Recette</w:t>
             </w:r>
           </w:p>
@@ -9645,7 +9933,7 @@
         <w:keepLines/>
         <w:spacing w:before="180" w:after="80"/>
       </w:pPr>
-      <w:bookmarkStart w:id="6" w:name="_Toc233327272"/>
+      <w:bookmarkStart w:id="6" w:name="_Toc233329710"/>
       <w:r>
         <w:t>4.1. RACI synthétique</w:t>
       </w:r>
@@ -10794,7 +11082,7 @@
         <w:keepNext/>
         <w:keepLines/>
       </w:pPr>
-      <w:bookmarkStart w:id="7" w:name="_Toc233327273"/>
+      <w:bookmarkStart w:id="7" w:name="_Toc233329711"/>
       <w:r>
         <w:t>5. Présentation de la solution technique</w:t>
       </w:r>
@@ -10819,7 +11107,7 @@
         <w:keepLines/>
         <w:spacing w:before="180" w:after="80"/>
       </w:pPr>
-      <w:bookmarkStart w:id="8" w:name="_Toc233327274"/>
+      <w:bookmarkStart w:id="8" w:name="_Toc233329712"/>
       <w:r>
         <w:t>5.1. Architecture globale et segmentation</w:t>
       </w:r>
@@ -10848,7 +11136,6 @@
           <w:color w:val="111827"/>
           <w:sz w:val="20"/>
         </w:rPr>
-        <w:lastRenderedPageBreak/>
         <w:drawing>
           <wp:inline distT="0" distB="0" distL="0" distR="0" wp14:anchorId="7CBBF077" wp14:editId="5104F339">
             <wp:extent cx="5832000" cy="3921851"/>
@@ -11831,7 +12118,7 @@
         <w:keepLines/>
         <w:spacing w:before="180" w:after="80"/>
       </w:pPr>
-      <w:bookmarkStart w:id="9" w:name="_Toc233327275"/>
+      <w:bookmarkStart w:id="9" w:name="_Toc233329713"/>
       <w:r>
         <w:t>5.2. Pare-feu pfSense, flux et journalisation SOC</w:t>
       </w:r>
@@ -11858,7 +12145,6 @@
           <w:color w:val="111827"/>
           <w:sz w:val="20"/>
         </w:rPr>
-        <w:lastRenderedPageBreak/>
         <w:t>Les aliases pfSense remplacent les adresses IP brutes par des objets métier : ADMIN_SUBNET, SERVERS_SUBNET, SOC_SUBNET, DAYLIGHT_APP, DNS_ALLOWED ou SOC_WAZUH. Cette méthode facilite la maintenance et permet au client de relire une politique de sécurité sans devoir interpréter chaque adresse isolément.</w:t>
       </w:r>
     </w:p>
@@ -13921,7 +14207,6 @@
           <w:color w:val="111827"/>
           <w:sz w:val="20"/>
         </w:rPr>
-        <w:lastRenderedPageBreak/>
         <w:drawing>
           <wp:inline distT="0" distB="0" distL="0" distR="0" wp14:anchorId="45F3C46C" wp14:editId="33C34099">
             <wp:extent cx="5832000" cy="2970432"/>
@@ -14056,7 +14341,6 @@
           <w:color w:val="111827"/>
           <w:sz w:val="20"/>
         </w:rPr>
-        <w:lastRenderedPageBreak/>
         <w:t>Figure 3 : Configuration syslog pfSense vers Wazuh : remote logging activé vers 10.10.50.10:514.</w:t>
       </w:r>
     </w:p>
@@ -14141,7 +14425,7 @@
         <w:keepLines/>
         <w:spacing w:before="180" w:after="80" w:line="259" w:lineRule="auto"/>
       </w:pPr>
-      <w:bookmarkStart w:id="10" w:name="_Toc233327276"/>
+      <w:bookmarkStart w:id="10" w:name="_Toc233329714"/>
       <w:r>
         <w:t>5.2.1. Chaîne de preuves pfSense présentée au client</w:t>
       </w:r>
@@ -14168,15 +14452,7 @@
           <w:color w:val="111827"/>
           <w:sz w:val="20"/>
         </w:rPr>
-        <w:t xml:space="preserve">Deux supports de conception accompagnent cette démonstration. La matrice Excel YVAN_Architecture_Zones_Flux_pfSense_Wazuh.xlsx regroupe les feuilles ZONES_ADRESSAGE, FLUX_REGLES, ALIASES_PFSENSE, INTERFACES_PFSENSE, PORTS_WAZUH et CAPTURES_A_MONTRER. Le fichier YVAN_Schemas_Architecture.drawio sert de support graphique pour </w:t>
-      </w:r>
-      <w:r>
-        <w:rPr>
-          <w:color w:val="111827"/>
-          <w:sz w:val="20"/>
-        </w:rPr>
-        <w:lastRenderedPageBreak/>
-        <w:t>relier l’architecture globale, les flux pfSense et la chaîne SOC Wazuh. Ces fichiers évitent que la configuration reste dépendante de captures isolées : ils donnent une lecture maintenable et réutilisable par le client.</w:t>
+        <w:t>Deux supports de conception accompagnent cette démonstration. La matrice Excel YVAN_Architecture_Zones_Flux_pfSense_Wazuh.xlsx regroupe les feuilles ZONES_ADRESSAGE, FLUX_REGLES, ALIASES_PFSENSE, INTERFACES_PFSENSE, PORTS_WAZUH et CAPTURES_A_MONTRER. Le fichier YVAN_Schemas_Architecture.drawio sert de support graphique pour relier l’architecture globale, les flux pfSense et la chaîne SOC Wazuh. Ces fichiers évitent que la configuration reste dépendante de captures isolées : ils donnent une lecture maintenable et réutilisable par le client.</w:t>
       </w:r>
     </w:p>
     <w:p>
@@ -14186,7 +14462,7 @@
         <w:keepLines/>
         <w:spacing w:before="180" w:after="80" w:line="259" w:lineRule="auto"/>
       </w:pPr>
-      <w:bookmarkStart w:id="11" w:name="_Toc233327277"/>
+      <w:bookmarkStart w:id="11" w:name="_Toc233329715"/>
       <w:r>
         <w:t>Preuve A : pfSense opérationnel et interfaces actives</w:t>
       </w:r>
@@ -14274,7 +14550,7 @@
         <w:keepLines/>
         <w:spacing w:before="180" w:after="80" w:line="259" w:lineRule="auto"/>
       </w:pPr>
-      <w:bookmarkStart w:id="12" w:name="_Toc233327278"/>
+      <w:bookmarkStart w:id="12" w:name="_Toc233329716"/>
       <w:r>
         <w:t>Preuve B : Affectation WAN/LAN maîtrisée</w:t>
       </w:r>
@@ -14304,7 +14580,6 @@
           <w:color w:val="111827"/>
           <w:sz w:val="20"/>
         </w:rPr>
-        <w:lastRenderedPageBreak/>
         <w:drawing>
           <wp:inline distT="0" distB="0" distL="0" distR="0" wp14:anchorId="40C02E50" wp14:editId="27BD9598">
             <wp:extent cx="5328000" cy="2114485"/>
@@ -14363,7 +14638,7 @@
         <w:keepLines/>
         <w:spacing w:before="180" w:after="80" w:line="259" w:lineRule="auto"/>
       </w:pPr>
-      <w:bookmarkStart w:id="13" w:name="_Toc233327279"/>
+      <w:bookmarkStart w:id="13" w:name="_Toc233329717"/>
       <w:r>
         <w:t>Preuve C : Objets réseau lisibles et maintenables</w:t>
       </w:r>
@@ -14451,7 +14726,7 @@
         <w:keepLines/>
         <w:spacing w:before="180" w:after="80" w:line="259" w:lineRule="auto"/>
       </w:pPr>
-      <w:bookmarkStart w:id="14" w:name="_Toc233327280"/>
+      <w:bookmarkStart w:id="14" w:name="_Toc233329718"/>
       <w:r>
         <w:t>Preuve D : Posture WAN restrictive</w:t>
       </w:r>
@@ -14481,7 +14756,6 @@
           <w:color w:val="111827"/>
           <w:sz w:val="20"/>
         </w:rPr>
-        <w:lastRenderedPageBreak/>
         <w:drawing>
           <wp:inline distT="0" distB="0" distL="0" distR="0" wp14:anchorId="27EECBA2" wp14:editId="0F06DF18">
             <wp:extent cx="5688000" cy="3159439"/>
@@ -14540,7 +14814,7 @@
         <w:keepLines/>
         <w:spacing w:before="180" w:after="80" w:line="259" w:lineRule="auto"/>
       </w:pPr>
-      <w:bookmarkStart w:id="15" w:name="_Toc233327281"/>
+      <w:bookmarkStart w:id="15" w:name="_Toc233329719"/>
       <w:r>
         <w:t>Preuve E : Blocages journalisés côté firewall</w:t>
       </w:r>
@@ -14570,7 +14844,6 @@
           <w:color w:val="111827"/>
           <w:sz w:val="20"/>
         </w:rPr>
-        <w:lastRenderedPageBreak/>
         <w:drawing>
           <wp:inline distT="0" distB="0" distL="0" distR="0" wp14:anchorId="15A95C03" wp14:editId="1D3B8CB9">
             <wp:extent cx="5688000" cy="5481164"/>
@@ -14641,7 +14914,7 @@
         <w:keepLines/>
         <w:spacing w:before="180" w:after="80"/>
       </w:pPr>
-      <w:bookmarkStart w:id="16" w:name="_Toc233327282"/>
+      <w:bookmarkStart w:id="16" w:name="_Toc233329720"/>
       <w:r>
         <w:t>5.3. Plateforme SIEM Wazuh et collecte multi-source</w:t>
       </w:r>
@@ -14997,7 +15270,6 @@
                 <w:color w:val="111827"/>
                 <w:sz w:val="18"/>
               </w:rPr>
-              <w:lastRenderedPageBreak/>
               <w:t>Wazuh Dashboard</w:t>
             </w:r>
           </w:p>
@@ -15769,7 +16041,6 @@
           <w:color w:val="111827"/>
           <w:sz w:val="20"/>
         </w:rPr>
-        <w:lastRenderedPageBreak/>
         <w:drawing>
           <wp:inline distT="0" distB="0" distL="0" distR="0" wp14:anchorId="352DCC5A" wp14:editId="390565DF">
             <wp:extent cx="5832000" cy="3093972"/>
@@ -16249,7 +16520,7 @@
         <w:keepLines/>
         <w:spacing w:before="180" w:after="80"/>
       </w:pPr>
-      <w:bookmarkStart w:id="17" w:name="_Toc233327283"/>
+      <w:bookmarkStart w:id="17" w:name="_Toc233329721"/>
       <w:r>
         <w:t>5.4. Détection, qualification et scénarios de preuve</w:t>
       </w:r>
@@ -17078,7 +17349,6 @@
                 <w:color w:val="111827"/>
                 <w:sz w:val="16"/>
               </w:rPr>
-              <w:lastRenderedPageBreak/>
               <w:t>Blocage WAN pfSense</w:t>
             </w:r>
           </w:p>
@@ -17488,7 +17758,6 @@
                 <w:color w:val="174A7C"/>
                 <w:sz w:val="18"/>
               </w:rPr>
-              <w:lastRenderedPageBreak/>
               <w:t>Niveau</w:t>
             </w:r>
           </w:p>
@@ -17957,7 +18226,7 @@
         <w:keepLines/>
         <w:spacing w:before="180" w:after="80"/>
       </w:pPr>
-      <w:bookmarkStart w:id="18" w:name="_Toc233327284"/>
+      <w:bookmarkStart w:id="18" w:name="_Toc233329722"/>
       <w:r>
         <w:rPr>
           <w:sz w:val="26"/>
@@ -17998,9 +18267,8 @@
         <w:pageBreakBefore/>
         <w:spacing w:before="180" w:after="80"/>
       </w:pPr>
-      <w:bookmarkStart w:id="19" w:name="_Toc233327285"/>
+      <w:bookmarkStart w:id="19" w:name="_Toc233329723"/>
       <w:r>
-        <w:lastRenderedPageBreak/>
         <w:t>5.5.1. Chaîne opérationnelle proposée pour Daylight</w:t>
       </w:r>
       <w:bookmarkEnd w:id="19"/>
@@ -18622,7 +18890,7 @@
         <w:keepLines/>
         <w:spacing w:before="180" w:after="80"/>
       </w:pPr>
-      <w:bookmarkStart w:id="20" w:name="_Toc233327286"/>
+      <w:bookmarkStart w:id="20" w:name="_Toc233329724"/>
       <w:r>
         <w:t>5.5.2. Playbooks de réponse aux incidents</w:t>
       </w:r>
@@ -19427,7 +19695,7 @@
         <w:keepLines/>
         <w:spacing w:before="180" w:after="80"/>
       </w:pPr>
-      <w:bookmarkStart w:id="21" w:name="_Toc233327287"/>
+      <w:bookmarkStart w:id="21" w:name="_Toc233329725"/>
       <w:r>
         <w:t>5.5.3. Qualification des alertes et niveaux de décision</w:t>
       </w:r>
@@ -19686,7 +19954,6 @@
                 <w:color w:val="111827"/>
                 <w:sz w:val="18"/>
               </w:rPr>
-              <w:lastRenderedPageBreak/>
               <w:t>7 à 9</w:t>
             </w:r>
           </w:p>
@@ -19966,7 +20233,7 @@
         <w:keepLines/>
         <w:spacing w:before="180" w:after="80"/>
       </w:pPr>
-      <w:bookmarkStart w:id="22" w:name="_Toc233327288"/>
+      <w:bookmarkStart w:id="22" w:name="_Toc233329726"/>
       <w:r>
         <w:t>5.5.4. Procédures d’exploitation du démonstrateur</w:t>
       </w:r>
@@ -20589,7 +20856,7 @@
         <w:keepLines/>
         <w:spacing w:before="180" w:after="80"/>
       </w:pPr>
-      <w:bookmarkStart w:id="23" w:name="_Toc233327289"/>
+      <w:bookmarkStart w:id="23" w:name="_Toc233329727"/>
       <w:r>
         <w:t>5.5.5. Retours d’expérience et amélioration continue</w:t>
       </w:r>
@@ -21117,15 +21384,7 @@
           <w:color w:val="111827"/>
           <w:sz w:val="20"/>
         </w:rPr>
-        <w:t xml:space="preserve">À court terme, ces actions restent opérées manuellement afin de garder le démonstrateur simple et contrôlable. En trajectoire de production, elles pourront être raccordées à un outil de ticketing ou à une brique </w:t>
-      </w:r>
-      <w:r>
-        <w:rPr>
-          <w:color w:val="111827"/>
-          <w:sz w:val="20"/>
-        </w:rPr>
-        <w:lastRenderedPageBreak/>
-        <w:t>SOAR légère, par exemple TheHive, Shuffle ou Cortex, pour suivre les incidents, affecter les tâches et conserver l’historique de traitement. Ces outils sont donc présentés comme une évolution industrialisable, pas comme une dépendance obligatoire du MVP.</w:t>
+        <w:t>À court terme, ces actions restent opérées manuellement afin de garder le démonstrateur simple et contrôlable. En trajectoire de production, elles pourront être raccordées à un outil de ticketing ou à une brique SOAR légère, par exemple TheHive, Shuffle ou Cortex, pour suivre les incidents, affecter les tâches et conserver l’historique de traitement. Ces outils sont donc présentés comme une évolution industrialisable, pas comme une dépendance obligatoire du MVP.</w:t>
       </w:r>
     </w:p>
     <w:p>
@@ -21135,7 +21394,7 @@
         <w:keepLines/>
         <w:spacing w:before="180" w:after="80"/>
       </w:pPr>
-      <w:bookmarkStart w:id="24" w:name="_Toc233327290"/>
+      <w:bookmarkStart w:id="24" w:name="_Toc233329728"/>
       <w:r>
         <w:t>5.5.6. Valeur apportée au client</w:t>
       </w:r>
@@ -21160,7 +21419,7 @@
         <w:keepLines/>
         <w:spacing w:before="180" w:after="80"/>
       </w:pPr>
-      <w:bookmarkStart w:id="25" w:name="_Toc233327291"/>
+      <w:bookmarkStart w:id="25" w:name="_Toc233329729"/>
       <w:r>
         <w:t>5.6. Synthèse technique et conformité au cahier des charges</w:t>
       </w:r>
@@ -21981,7 +22240,7 @@
         <w:keepNext/>
         <w:keepLines/>
       </w:pPr>
-      <w:bookmarkStart w:id="26" w:name="_Toc233327292"/>
+      <w:bookmarkStart w:id="26" w:name="_Toc233329730"/>
       <w:r>
         <w:t>6. Conclusion</w:t>
       </w:r>
@@ -22031,12 +22290,11 @@
         <w:pageBreakBefore/>
         <w:spacing w:after="80"/>
       </w:pPr>
-      <w:bookmarkStart w:id="27" w:name="_Toc233327293"/>
+      <w:bookmarkStart w:id="27" w:name="_Toc233329731"/>
       <w:r>
         <w:rPr>
           <w:sz w:val="26"/>
         </w:rPr>
-        <w:lastRenderedPageBreak/>
         <w:t>6.1. Guide d’utilisation synthétique</w:t>
       </w:r>
       <w:bookmarkEnd w:id="27"/>
@@ -22559,7 +22817,7 @@
         <w:keepNext/>
         <w:keepLines/>
       </w:pPr>
-      <w:bookmarkStart w:id="28" w:name="_Toc233327294"/>
+      <w:bookmarkStart w:id="28" w:name="_Toc233329732"/>
       <w:r>
         <w:t>Annexes</w:t>
       </w:r>
@@ -22572,7 +22830,7 @@
         <w:keepLines/>
         <w:spacing w:before="180" w:after="80"/>
       </w:pPr>
-      <w:bookmarkStart w:id="29" w:name="_Toc233327295"/>
+      <w:bookmarkStart w:id="29" w:name="_Toc233329733"/>
       <w:r>
         <w:t>Annexe A : Liste des preuves intégrées au rapport</w:t>
       </w:r>
@@ -23771,9 +24029,8 @@
         <w:pageBreakBefore/>
         <w:spacing w:before="180" w:after="80"/>
       </w:pPr>
-      <w:bookmarkStart w:id="30" w:name="_Toc233327296"/>
+      <w:bookmarkStart w:id="30" w:name="_Toc233329734"/>
       <w:r>
-        <w:lastRenderedPageBreak/>
         <w:t>Annexe B : Ports et flux principaux</w:t>
       </w:r>
       <w:bookmarkEnd w:id="30"/>
@@ -24679,7 +24936,7 @@
         <w:keepLines/>
         <w:spacing w:before="180" w:after="80"/>
       </w:pPr>
-      <w:bookmarkStart w:id="31" w:name="_Toc233327297"/>
+      <w:bookmarkStart w:id="31" w:name="_Toc233329735"/>
       <w:r>
         <w:t>Annexe C : Recommandations d’industrialisation</w:t>
       </w:r>
@@ -25397,12 +25654,196 @@
         <w:spacing w:after="100"/>
       </w:pPr>
     </w:p>
+    <w:p>
+      <w:r>
+        <w:br w:type="page"/>
+      </w:r>
+    </w:p>
+    <w:p>
+      <w:pPr>
+        <w:pStyle w:val="Heading1"/>
+      </w:pPr>
+      <w:bookmarkStart w:id="32" w:name="_Toc233329736"/>
+      <w:r>
+        <w:t>Annexe D : Sch?mas d?taill?s de la contribution architecture</w:t>
+      </w:r>
+      <w:bookmarkEnd w:id="32"/>
+    </w:p>
+    <w:p>
+      <w:r>
+        <w:t>Cette annexe compl?te la partie technique port?e par Yvan FOCSA. Elle ne remplace pas la section principale du rapport groupe : elle sert de support de preuve et de lecture pour le client lorsque le jury souhaite v?rifier la coh?rence entre l?architecture, les r?gles pfSense, la journalisation et l?int?gration Wazuh. Les fichiers sources restent disponibles dans le d?p?t, dans le dossier 02_Participants/Yvan_FOCSA.</w:t>
+      </w:r>
+    </w:p>
+    <w:p>
+      <w:pPr>
+        <w:pStyle w:val="Heading2"/>
+      </w:pPr>
+      <w:bookmarkStart w:id="33" w:name="_Toc233329737"/>
+      <w:r>
+        <w:t>Sch?ma pfSense, flux autoris?s et flux bloqu?s</w:t>
+      </w:r>
+      <w:bookmarkEnd w:id="33"/>
+    </w:p>
+    <w:p>
+      <w:pPr>
+        <w:jc w:val="center"/>
+      </w:pPr>
+      <w:r>
+        <w:rPr>
+          <w:noProof/>
+        </w:rPr>
+        <w:drawing>
+          <wp:inline distT="0" distB="0" distL="0" distR="0" wp14:anchorId="2AABB639" wp14:editId="187A7BE1">
+            <wp:extent cx="5852160" cy="3857767"/>
+            <wp:effectExtent l="0" t="0" r="0" b="0"/>
+            <wp:docPr id="16" name="Picture 16"/>
+            <wp:cNvGraphicFramePr>
+              <a:graphicFrameLocks xmlns:a="http://schemas.openxmlformats.org/drawingml/2006/main" noChangeAspect="1"/>
+            </wp:cNvGraphicFramePr>
+            <a:graphic xmlns:a="http://schemas.openxmlformats.org/drawingml/2006/main">
+              <a:graphicData uri="http://schemas.openxmlformats.org/drawingml/2006/picture">
+                <pic:pic xmlns:pic="http://schemas.openxmlformats.org/drawingml/2006/picture">
+                  <pic:nvPicPr>
+                    <pic:cNvPr id="0" name="YVAN_Schemas_Architecture-pfSense flux et regles.drawio.png"/>
+                    <pic:cNvPicPr/>
+                  </pic:nvPicPr>
+                  <pic:blipFill>
+                    <a:blip r:embed="rId22"/>
+                    <a:stretch>
+                      <a:fillRect/>
+                    </a:stretch>
+                  </pic:blipFill>
+                  <pic:spPr>
+                    <a:xfrm>
+                      <a:off x="0" y="0"/>
+                      <a:ext cx="5852160" cy="3857767"/>
+                    </a:xfrm>
+                    <a:prstGeom prst="rect">
+                      <a:avLst/>
+                    </a:prstGeom>
+                  </pic:spPr>
+                </pic:pic>
+              </a:graphicData>
+            </a:graphic>
+          </wp:inline>
+        </w:drawing>
+      </w:r>
+    </w:p>
+    <w:p>
+      <w:pPr>
+        <w:jc w:val="center"/>
+      </w:pPr>
+      <w:r>
+        <w:rPr>
+          <w:i/>
+          <w:sz w:val="18"/>
+        </w:rPr>
+        <w:t>Figure compl?mentaire : pfSense comme point de contr?le des flux Daylight, avec les autorisations m?tier, les blocages de zones sensibles et la journalisation vers le SOC.</w:t>
+      </w:r>
+    </w:p>
+    <w:p>
+      <w:r>
+        <w:t>Ce sch?ma d?taille la logique d?fendue dans la section pfSense du rapport : les utilisateurs disposent uniquement des flux n?cessaires vers l?application m?tier et le DNS, tandis que les acc?s directs vers les zones serveurs, administration et SOC sont bloqu?s ou journalis?s. Cette repr?sentation permet au client de comprendre rapidement que la segmentation n?est pas seulement d?clarative : elle est traduite en r?gles lisibles et v?rifiables.</w:t>
+      </w:r>
+    </w:p>
+    <w:p>
+      <w:r>
+        <w:br w:type="page"/>
+      </w:r>
+    </w:p>
+    <w:p>
+      <w:pPr>
+        <w:pStyle w:val="Heading2"/>
+      </w:pPr>
+      <w:bookmarkStart w:id="34" w:name="_Toc233329738"/>
+      <w:r>
+        <w:t>Sch?ma SOC Wazuh et cha?ne de supervision</w:t>
+      </w:r>
+      <w:bookmarkEnd w:id="34"/>
+    </w:p>
+    <w:p>
+      <w:pPr>
+        <w:jc w:val="center"/>
+      </w:pPr>
+      <w:r>
+        <w:rPr>
+          <w:noProof/>
+        </w:rPr>
+        <w:drawing>
+          <wp:inline distT="0" distB="0" distL="0" distR="0" wp14:anchorId="2DEF320B" wp14:editId="4C5F9887">
+            <wp:extent cx="5943600" cy="3254538"/>
+            <wp:effectExtent l="0" t="0" r="0" b="0"/>
+            <wp:docPr id="17" name="Picture 17"/>
+            <wp:cNvGraphicFramePr>
+              <a:graphicFrameLocks xmlns:a="http://schemas.openxmlformats.org/drawingml/2006/main" noChangeAspect="1"/>
+            </wp:cNvGraphicFramePr>
+            <a:graphic xmlns:a="http://schemas.openxmlformats.org/drawingml/2006/main">
+              <a:graphicData uri="http://schemas.openxmlformats.org/drawingml/2006/picture">
+                <pic:pic xmlns:pic="http://schemas.openxmlformats.org/drawingml/2006/picture">
+                  <pic:nvPicPr>
+                    <pic:cNvPr id="0" name="YVAN_Schemas_Architecture-SOC Wazuh.drawio.png"/>
+                    <pic:cNvPicPr/>
+                  </pic:nvPicPr>
+                  <pic:blipFill>
+                    <a:blip r:embed="rId23"/>
+                    <a:stretch>
+                      <a:fillRect/>
+                    </a:stretch>
+                  </pic:blipFill>
+                  <pic:spPr>
+                    <a:xfrm>
+                      <a:off x="0" y="0"/>
+                      <a:ext cx="5943600" cy="3254538"/>
+                    </a:xfrm>
+                    <a:prstGeom prst="rect">
+                      <a:avLst/>
+                    </a:prstGeom>
+                  </pic:spPr>
+                </pic:pic>
+              </a:graphicData>
+            </a:graphic>
+          </wp:inline>
+        </w:drawing>
+      </w:r>
+    </w:p>
+    <w:p>
+      <w:pPr>
+        <w:jc w:val="center"/>
+      </w:pPr>
+      <w:r>
+        <w:rPr>
+          <w:i/>
+          <w:sz w:val="18"/>
+        </w:rPr>
+        <w:t>Figure compl?mentaire : cha?ne SOC Wazuh, depuis les sources de logs jusqu?aux r?les analyste, supervision et administrateur.</w:t>
+      </w:r>
+    </w:p>
+    <w:p>
+      <w:r>
+        <w:t>Ce deuxi?me sch?ma relie la contribution r?seau ? la contribution SIEM. Il montre que pfSense n?est pas isol? : ses journaux sont envoy?s vers Wazuh en syslog UDP 514, au m?me titre que les autres sources du d?monstrateur. Les ?v?nements issus du firewall deviennent ensuite exploitables dans les vues Wazuh, avec des r?gles d?di?es comme 110010 pour le trafic entrant bloqu? et 110020 pour les tentatives de mouvement lat?ral vers l?administration.</w:t>
+      </w:r>
+    </w:p>
+    <w:p>
+      <w:pPr>
+        <w:pStyle w:val="Heading2"/>
+      </w:pPr>
+      <w:bookmarkStart w:id="35" w:name="_Toc233329739"/>
+      <w:r>
+        <w:t>Ressources associ?es dans le d?p?t</w:t>
+      </w:r>
+      <w:bookmarkEnd w:id="35"/>
+    </w:p>
+    <w:p>
+      <w:r>
+        <w:t>La partie Yvan FOCSA du d?p?t contient ?galement la matrice Excel d?architecture, les captures pfSense, les exports de sch?mas et les fichiers de configuration. Ces ?l?ments ne sont pas tous recopi?s int?gralement dans le corps du rapport pour conserver une lecture client fluide, mais ils sont disponibles comme preuves d?taill?es dans 02_Participants/Yvan_FOCSA.</w:t>
+      </w:r>
+    </w:p>
     <w:sectPr>
-      <w:headerReference w:type="even" r:id="rId22"/>
-      <w:headerReference w:type="default" r:id="rId23"/>
-      <w:footerReference w:type="default" r:id="rId24"/>
-      <w:headerReference w:type="first" r:id="rId25"/>
-      <w:footerReference w:type="first" r:id="rId26"/>
+      <w:headerReference w:type="even" r:id="rId24"/>
+      <w:headerReference w:type="default" r:id="rId25"/>
+      <w:footerReference w:type="default" r:id="rId26"/>
+      <w:headerReference w:type="first" r:id="rId27"/>
+      <w:footerReference w:type="first" r:id="rId28"/>
       <w:pgSz w:w="12240" w:h="15840"/>
       <w:pgMar w:top="1134" w:right="1247" w:bottom="1134" w:left="1247" w:header="708" w:footer="708" w:gutter="0"/>
       <w:cols w:space="720"/>

</xml_diff>